<commit_message>
Add GTM and The Ask slides, renumber pitch to 12 slides
- New slide 8: Go-to-market (10→100→2500 clients in 3 phases)
- New slide 11: The Ask — $5,000 USD breakdown + milestone unlocked
- All slides renumbered 1-12 (was 1-10)
- Add slide 6 (Como funciona) to guion with 15s cue
- Update timing table in guion
- Regenerate both Word docs

Co-Authored-By: Claude Sonnet 4.6 <noreply@anthropic.com>
</commit_message>
<xml_diff>
--- a/docs/guion_pitch.docx
+++ b/docs/guion_pitch.docx
@@ -10,9 +10,9 @@
       <w:r>
         <w:rPr>
           <w:color w:val="25D366"/>
-          <w:sz w:val="44"/>
+          <w:sz w:val="40"/>
         </w:rPr>
-        <w:t>RespondIA — Draft del Pitch</w:t>
+        <w:t>RespondIA — Guión del Pitch</w:t>
       </w:r>
     </w:p>
     <w:p>
@@ -36,7 +36,7 @@
           <w:color w:val="646464"/>
           <w:sz w:val="20"/>
         </w:rPr>
-        <w:t>Duración objetivo: 7 min pitch + 3 min preguntas</w:t>
+        <w:t>7 minutos de pitch + 3 minutos de preguntas</w:t>
       </w:r>
     </w:p>
     <w:p>
@@ -71,22 +71,17 @@
     </w:p>
     <w:p/>
     <w:p>
-      <w:pPr>
-        <w:ind w:left="360"/>
-      </w:pPr>
       <w:r>
         <w:rPr>
-          <w:i/>
-          <w:color w:val="646464"/>
-          <w:sz w:val="20"/>
+          <w:b w:val="0"/>
         </w:rPr>
-        <w:t>Pausa breve. Mirar al público antes de hablar.</w:t>
+        <w:t>*Pausa breve. Mirar al público antes de hablar.*</w:t>
       </w:r>
     </w:p>
     <w:p/>
     <w:p>
       <w:pPr>
-        <w:ind w:left="432"/>
+        <w:ind w:left="360"/>
       </w:pPr>
       <w:r>
         <w:rPr>
@@ -98,22 +93,17 @@
     </w:p>
     <w:p/>
     <w:p>
-      <w:pPr>
-        <w:ind w:left="360"/>
-      </w:pPr>
       <w:r>
         <w:rPr>
-          <w:i/>
-          <w:color w:val="646464"/>
-          <w:sz w:val="20"/>
+          <w:b w:val="0"/>
         </w:rPr>
-        <w:t>Esperar reacción.</w:t>
+        <w:t>*Esperar reacción.*</w:t>
       </w:r>
     </w:p>
     <w:p/>
     <w:p>
       <w:pPr>
-        <w:ind w:left="432"/>
+        <w:ind w:left="360"/>
       </w:pPr>
       <w:r>
         <w:rPr>
@@ -148,7 +138,7 @@
     <w:p/>
     <w:p>
       <w:pPr>
-        <w:ind w:left="432"/>
+        <w:ind w:left="360"/>
       </w:pPr>
       <w:r>
         <w:rPr>
@@ -213,7 +203,7 @@
     <w:p/>
     <w:p>
       <w:pPr>
-        <w:ind w:left="432"/>
+        <w:ind w:left="360"/>
       </w:pPr>
       <w:r>
         <w:rPr>
@@ -374,16 +364,24 @@
     </w:p>
     <w:p/>
     <w:p>
+      <w:r>
+        <w:rPr>
+          <w:b w:val="0"/>
+        </w:rPr>
+        <w:t>*Abrir WhatsApp en el celular y el panel en la pantalla, o mostrar el chat animado del pitch deck.*</w:t>
+      </w:r>
+    </w:p>
+    <w:p/>
+    <w:p>
       <w:pPr>
         <w:ind w:left="360"/>
       </w:pPr>
       <w:r>
         <w:rPr>
-          <w:i/>
-          <w:color w:val="646464"/>
-          <w:sz w:val="20"/>
+          <w:b w:val="0"/>
+          <w:sz w:val="24"/>
         </w:rPr>
-        <w:t>Abrir WhatsApp en el celular y el panel en la pantalla, o mostrar el chat animado del pitch deck.</w:t>
+        <w:t>"Les voy a mostrar el flujo real. Esto es el sandbox de Twilio funcionando en producción."</w:t>
       </w:r>
     </w:p>
     <w:p/>
@@ -396,26 +394,12 @@
           <w:b w:val="0"/>
           <w:sz w:val="24"/>
         </w:rPr>
-        <w:t>"Les voy a mostrar el flujo real. Esto es el sandbox de Twilio funcionando en producción."</w:t>
-      </w:r>
-    </w:p>
-    <w:p/>
-    <w:p>
-      <w:pPr>
-        <w:ind w:left="360"/>
-      </w:pPr>
-      <w:r>
-        <w:rPr>
-          <w:i/>
-          <w:color w:val="646464"/>
-          <w:sz w:val="20"/>
-        </w:rPr>
         <w:t>Enviar: "hola tienen polos talla M?"</w:t>
       </w:r>
     </w:p>
     <w:p>
       <w:pPr>
-        <w:ind w:left="432"/>
+        <w:ind w:left="360"/>
       </w:pPr>
       <w:r>
         <w:rPr>
@@ -428,20 +412,19 @@
     <w:p/>
     <w:p>
       <w:pPr>
-        <w:ind w:left="360"/>
+        <w:ind w:left="432"/>
       </w:pPr>
       <w:r>
         <w:rPr>
-          <w:i/>
-          <w:color w:val="646464"/>
-          <w:sz w:val="20"/>
+          <w:b w:val="0"/>
+          <w:sz w:val="24"/>
         </w:rPr>
         <w:t>Enviar: "uno negro, cuánto es el total?"</w:t>
       </w:r>
     </w:p>
     <w:p>
       <w:pPr>
-        <w:ind w:left="432"/>
+        <w:ind w:left="360"/>
       </w:pPr>
       <w:r>
         <w:rPr>
@@ -453,21 +436,16 @@
     </w:p>
     <w:p/>
     <w:p>
-      <w:pPr>
-        <w:ind w:left="360"/>
-      </w:pPr>
       <w:r>
         <w:rPr>
-          <w:i/>
-          <w:color w:val="646464"/>
-          <w:sz w:val="20"/>
+          <w:b w:val="0"/>
         </w:rPr>
-        <w:t>Enviar foto de captura:</w:t>
+        <w:t>*Enviar foto de captura:*</w:t>
       </w:r>
     </w:p>
     <w:p>
       <w:pPr>
-        <w:ind w:left="432"/>
+        <w:ind w:left="360"/>
       </w:pPr>
       <w:r>
         <w:rPr>
@@ -479,21 +457,16 @@
     </w:p>
     <w:p/>
     <w:p>
-      <w:pPr>
-        <w:ind w:left="360"/>
-      </w:pPr>
       <w:r>
         <w:rPr>
-          <w:i/>
-          <w:color w:val="646464"/>
-          <w:sz w:val="20"/>
+          <w:b w:val="0"/>
         </w:rPr>
-        <w:t>Mostrar panel de Streamlit:</w:t>
+        <w:t>*Mostrar panel de Streamlit:*</w:t>
       </w:r>
     </w:p>
     <w:p>
       <w:pPr>
-        <w:ind w:left="432"/>
+        <w:ind w:left="360"/>
       </w:pPr>
       <w:r>
         <w:rPr>
@@ -528,7 +501,7 @@
     <w:p/>
     <w:p>
       <w:pPr>
-        <w:ind w:left="432"/>
+        <w:ind w:left="360"/>
       </w:pPr>
       <w:r>
         <w:rPr>
@@ -590,7 +563,7 @@
     <w:p/>
     <w:p>
       <w:pPr>
-        <w:ind w:left="432"/>
+        <w:ind w:left="360"/>
       </w:pPr>
       <w:r>
         <w:rPr>
@@ -666,6 +639,14 @@
     <w:p/>
     <w:p>
       <w:pPr>
+        <w:pBdr>
+          <w:bottom w:val="single" w:sz="4" w:space="1" w:color="25D366"/>
+        </w:pBdr>
+      </w:pPr>
+    </w:p>
+    <w:p/>
+    <w:p>
+      <w:pPr>
         <w:pStyle w:val="Heading2"/>
       </w:pPr>
       <w:r>
@@ -674,13 +655,101 @@
           <w:color w:val="1E40AF"/>
           <w:sz w:val="26"/>
         </w:rPr>
-        <w:t>[SLIDE 8 — TRACCIÓN] Tracción (5:45 – 6:20)</w:t>
+        <w:t>[SLIDE 8 — GO-TO-MARKET] Go-to-market (5:10 – 5:30)</w:t>
+      </w:r>
+    </w:p>
+    <w:p/>
+    <w:p>
+      <w:pPr>
+        <w:ind w:left="360"/>
+      </w:pPr>
+      <w:r>
+        <w:rPr>
+          <w:b w:val="0"/>
+          <w:sz w:val="24"/>
+        </w:rPr>
+        <w:t>"De 0 a 2,500 clientes en 12 meses, en tres fases:</w:t>
+      </w:r>
+    </w:p>
+    <w:p/>
+    <w:p>
+      <w:r>
+        <w:rPr>
+          <w:b w:val="0"/>
+        </w:rPr>
+        <w:t xml:space="preserve">Los </w:t>
+      </w:r>
+      <w:r>
+        <w:rPr>
+          <w:b/>
+        </w:rPr>
+        <w:t>primeros 10</w:t>
+      </w:r>
+      <w:r>
+        <w:rPr>
+          <w:b w:val="0"/>
+        </w:rPr>
+        <w:t>: contacto directo con dueñas de boutiques en Lima, demo en vivo con su catálogo real, primer mes gratis.</w:t>
+      </w:r>
+    </w:p>
+    <w:p/>
+    <w:p>
+      <w:r>
+        <w:rPr>
+          <w:b w:val="0"/>
+        </w:rPr>
+        <w:t xml:space="preserve">Los </w:t>
+      </w:r>
+      <w:r>
+        <w:rPr>
+          <w:b/>
+        </w:rPr>
+        <w:t>primeros 100</w:t>
+      </w:r>
+      <w:r>
+        <w:rPr>
+          <w:b w:val="0"/>
+        </w:rPr>
+        <w:t>: Meta / IG Ads segmentados a dueños de tienda Lima. CPC estimado S/15, CAC S/200. TikTok orgánico con demos reales. Presupuesto: $3,000 USD.</w:t>
       </w:r>
     </w:p>
     <w:p/>
     <w:p>
       <w:pPr>
         <w:ind w:left="432"/>
+      </w:pPr>
+      <w:r>
+        <w:rPr>
+          <w:b w:val="0"/>
+          <w:sz w:val="24"/>
+        </w:rPr>
+        <w:t>Escala a 2,500</w:t>
+      </w:r>
+      <w:r>
+        <w:rPr>
+          <w:b/>
+        </w:rPr>
+        <w:t>: alianzas con gremios de Gamarra, programa de referidos (1 mes gratis por amigo referido), expansión interprovincial. Meta: MRR S/190,000."</w:t>
+      </w:r>
+    </w:p>
+    <w:p/>
+    <w:p>
+      <w:pPr>
+        <w:pStyle w:val="Heading2"/>
+      </w:pPr>
+      <w:r>
+        <w:rPr>
+          <w:b/>
+          <w:color w:val="1E40AF"/>
+          <w:sz w:val="26"/>
+        </w:rPr>
+        <w:t>[SLIDE 9 — TRACCIÓN] Tracción (5:45 – 6:20)</w:t>
+      </w:r>
+    </w:p>
+    <w:p/>
+    <w:p>
+      <w:pPr>
+        <w:ind w:left="360"/>
       </w:pPr>
       <w:r>
         <w:rPr>
@@ -727,13 +796,13 @@
           <w:color w:val="1E40AF"/>
           <w:sz w:val="26"/>
         </w:rPr>
-        <w:t>[SLIDE 9 — VISIÓN] Visión y roadmap (6:20 – 6:45)</w:t>
+        <w:t>[SLIDE 10 — VISIÓN] Visión y roadmap (6:20 – 6:45)</w:t>
       </w:r>
     </w:p>
     <w:p/>
     <w:p>
       <w:pPr>
-        <w:ind w:left="432"/>
+        <w:ind w:left="360"/>
       </w:pPr>
       <w:r>
         <w:rPr>
@@ -763,6 +832,14 @@
     <w:p/>
     <w:p>
       <w:pPr>
+        <w:pBdr>
+          <w:bottom w:val="single" w:sz="4" w:space="1" w:color="25D366"/>
+        </w:pBdr>
+      </w:pPr>
+    </w:p>
+    <w:p/>
+    <w:p>
+      <w:pPr>
         <w:pStyle w:val="Heading2"/>
       </w:pPr>
       <w:r>
@@ -771,13 +848,114 @@
           <w:color w:val="1E40AF"/>
           <w:sz w:val="26"/>
         </w:rPr>
-        <w:t>[SLIDE 10 — CIERRE] Cierre (6:45 – 7:00)</w:t>
+        <w:t>[SLIDE 11 — THE ASK] The ask (6:30 – 6:50)</w:t>
       </w:r>
     </w:p>
     <w:p/>
     <w:p>
       <w:pPr>
-        <w:ind w:left="432"/>
+        <w:ind w:left="360"/>
+      </w:pPr>
+      <w:r>
+        <w:rPr>
+          <w:b w:val="0"/>
+          <w:sz w:val="24"/>
+        </w:rPr>
+        <w:t xml:space="preserve">"Pedimos </w:t>
+      </w:r>
+      <w:r>
+        <w:rPr>
+          <w:b/>
+        </w:rPr>
+        <w:t>$5,000 USD</w:t>
+      </w:r>
+      <w:r>
+        <w:rPr>
+          <w:b w:val="0"/>
+          <w:sz w:val="24"/>
+        </w:rPr>
+        <w:t xml:space="preserve"> para llegar a 100 clientes pagantes.</w:t>
+      </w:r>
+    </w:p>
+    <w:p/>
+    <w:p>
+      <w:pPr>
+        <w:pStyle w:val="ListBullet"/>
+      </w:pPr>
+      <w:r>
+        <w:rPr>
+          <w:b/>
+        </w:rPr>
+        <w:t>$3,000</w:t>
+      </w:r>
+      <w:r>
+        <w:rPr>
+          <w:b w:val="0"/>
+        </w:rPr>
+        <w:t xml:space="preserve"> Meta/IG Ads — 3 meses de marketing</w:t>
+      </w:r>
+    </w:p>
+    <w:p>
+      <w:pPr>
+        <w:pStyle w:val="ListBullet"/>
+      </w:pPr>
+      <w:r>
+        <w:rPr>
+          <w:b/>
+        </w:rPr>
+        <w:t>$500</w:t>
+      </w:r>
+      <w:r>
+        <w:rPr>
+          <w:b w:val="0"/>
+        </w:rPr>
+        <w:t xml:space="preserve"> WhatsApp Business API + dominio propio</w:t>
+      </w:r>
+    </w:p>
+    <w:p>
+      <w:pPr>
+        <w:pStyle w:val="ListBullet"/>
+      </w:pPr>
+      <w:r>
+        <w:rPr>
+          <w:b/>
+        </w:rPr>
+        <w:t>$1,500</w:t>
+      </w:r>
+      <w:r>
+        <w:rPr>
+          <w:b w:val="0"/>
+        </w:rPr>
+        <w:t xml:space="preserve"> Operaciones — 3 meses</w:t>
+      </w:r>
+    </w:p>
+    <w:p/>
+    <w:p>
+      <w:r>
+        <w:rPr>
+          <w:b w:val="0"/>
+        </w:rPr>
+        <w:t>Con esos $5,000 llegamos a 100 clientes, MRR &gt; S/7,600, LTV/CAC validado en mercado real, churn medido. Esos datos nos abren la siguiente ronda para escalar a 2,500 clientes → S/190K MRR."</w:t>
+      </w:r>
+    </w:p>
+    <w:p/>
+    <w:p>
+      <w:pPr>
+        <w:pStyle w:val="Heading2"/>
+      </w:pPr>
+      <w:r>
+        <w:rPr>
+          <w:b/>
+          <w:color w:val="1E40AF"/>
+          <w:sz w:val="26"/>
+        </w:rPr>
+        <w:t>[SLIDE 12 — CIERRE] Cierre (6:45 – 7:00)</w:t>
+      </w:r>
+    </w:p>
+    <w:p/>
+    <w:p>
+      <w:pPr>
+        <w:ind w:left="360"/>
       </w:pPr>
       <w:r>
         <w:rPr>
@@ -824,19 +1002,27 @@
     </w:p>
     <w:p/>
     <w:p>
+      <w:pPr>
+        <w:pStyle w:val="Heading2"/>
+      </w:pPr>
       <w:r>
         <w:rPr>
-          <w:b w:val="0"/>
+          <w:b/>
+          <w:color w:val="1E40AF"/>
+          <w:sz w:val="26"/>
         </w:rPr>
-        <w:t>## Preguntas probables — respuestas preparadas</w:t>
+        <w:t>Preguntas probables — respuestas preparadas</w:t>
       </w:r>
     </w:p>
     <w:p/>
     <w:p>
+      <w:pPr>
+        <w:ind w:left="432"/>
+      </w:pPr>
       <w:r>
         <w:rPr>
-          <w:b/>
-          <w:color w:val="1E40AF"/>
+          <w:b w:val="0"/>
+          <w:sz w:val="24"/>
         </w:rPr>
         <w:t>"¿Por qué DeepSeek y no GPT-4?"</w:t>
       </w:r>
@@ -851,10 +1037,13 @@
     </w:p>
     <w:p/>
     <w:p>
+      <w:pPr>
+        <w:ind w:left="432"/>
+      </w:pPr>
       <w:r>
         <w:rPr>
-          <w:b/>
-          <w:color w:val="1E40AF"/>
+          <w:b w:val="0"/>
+          <w:sz w:val="24"/>
         </w:rPr>
         <w:t>"¿Qué pasa si Twilio cae?"</w:t>
       </w:r>
@@ -869,10 +1058,13 @@
     </w:p>
     <w:p/>
     <w:p>
+      <w:pPr>
+        <w:ind w:left="432"/>
+      </w:pPr>
       <w:r>
         <w:rPr>
-          <w:b/>
-          <w:color w:val="1E40AF"/>
+          <w:b w:val="0"/>
+          <w:sz w:val="24"/>
         </w:rPr>
         <w:t>"¿Cómo protegen los datos de los clientes?"</w:t>
       </w:r>
@@ -887,10 +1079,13 @@
     </w:p>
     <w:p/>
     <w:p>
+      <w:pPr>
+        <w:ind w:left="432"/>
+      </w:pPr>
       <w:r>
         <w:rPr>
-          <w:b/>
-          <w:color w:val="1E40AF"/>
+          <w:b w:val="0"/>
+          <w:sz w:val="24"/>
         </w:rPr>
         <w:t>"¿Cuánto tiempo tarda en configurarse?"</w:t>
       </w:r>
@@ -905,10 +1100,13 @@
     </w:p>
     <w:p/>
     <w:p>
+      <w:pPr>
+        <w:ind w:left="432"/>
+      </w:pPr>
       <w:r>
         <w:rPr>
-          <w:b/>
-          <w:color w:val="1E40AF"/>
+          <w:b w:val="0"/>
+          <w:sz w:val="24"/>
         </w:rPr>
         <w:t>"¿Funciona con cualquier tipo de negocio?"</w:t>
       </w:r>
@@ -931,21 +1129,16 @@
     </w:p>
     <w:p/>
     <w:p>
-      <w:pPr>
-        <w:ind w:left="360"/>
-      </w:pPr>
       <w:r>
         <w:rPr>
-          <w:i/>
-          <w:color w:val="646464"/>
-          <w:sz w:val="20"/>
+          <w:b w:val="0"/>
         </w:rPr>
-        <w:t>Tip de presentación: habla despacio en el problema y más rápido en la solución/traction. La demo es el corazón — si algo falla, muestra el chat animado del pitch deck. Lleva el celular cargado al 100%.</w:t>
+        <w:t>*Tip de presentación: habla despacio en el problema y más rápido en la solución/traction. La demo es el corazón — si algo falla, muestra el chat animado del pitch deck. Lleva el celular cargado al 100%.*</w:t>
       </w:r>
     </w:p>
     <w:p/>
     <w:sectPr>
-      <w:pgSz w:w="11906" w:h="16838"/>
+      <w:pgSz w:w="12240" w:h="15840"/>
       <w:pgMar w:top="1134" w:right="1247" w:bottom="1134" w:left="1247" w:header="720" w:footer="720" w:gutter="0"/>
       <w:cols w:space="720"/>
       <w:docGrid w:linePitch="360"/>

</xml_diff>